<commit_message>
Add an FAQs page under Resources
31 questions in six groups (about Otta, products and cover, applying and
renewing, claims, the Broker Portal, contact and complaints), written from the
product pages, fact sheets, claims page and portal docs. Questions open from a
link or search result, the page carries FAQPage structured data, and the
answers feed the website search and chat assistant. Adds the FAQ answers to
the copy tracker for sign-off.

Co-Authored-By: Claude Opus 5.5 <noreply@anthropic.com>
Claude-Session: https://claude.ai/code/session_01Eh5mpih4ShNW6P8Q6cSYEM
</commit_message>
<xml_diff>
--- a/docs/Otta copy tracker.docx
+++ b/docs/Otta copy tracker.docx
@@ -28,7 +28,7 @@
           <w:bCs/>
           <w:color w:val="2E7D74"/>
         </w:rPr>
-        <w:t xml:space="preserve">Copy tracker  |  37 items  |  Last updated 15 October 2026</w:t>
+        <w:t xml:space="preserve">Copy tracker  |  38 items  |  Last updated 15 October 2026</w:t>
       </w:r>
     </w:p>
     <w:p>
@@ -2149,6 +2149,119 @@
       <w:tr>
         <w:tc>
           <w:tcPr>
+            <w:tcW w:type="dxa" w:w="800"/>
+            <w:tcBorders>
+              <w:top w:val="single" w:color="BFC9C7" w:sz="4"/>
+              <w:left w:val="single" w:color="BFC9C7" w:sz="4"/>
+              <w:bottom w:val="single" w:color="BFC9C7" w:sz="4"/>
+              <w:right w:val="single" w:color="BFC9C7" w:sz="4"/>
+            </w:tcBorders>
+            <w:tcMar>
+              <w:top w:type="dxa" w:w="90"/>
+              <w:left w:type="dxa" w:w="120"/>
+              <w:bottom w:type="dxa" w:w="90"/>
+              <w:right w:type="dxa" w:w="120"/>
+            </w:tcMar>
+          </w:tcPr>
+          <w:p>
+            <w:pPr>
+              <w:spacing w:after="0"/>
+            </w:pPr>
+            <w:r>
+              <w:t xml:space="preserve">2.10</w:t>
+            </w:r>
+          </w:p>
+        </w:tc>
+        <w:tc>
+          <w:tcPr>
+            <w:tcW w:type="dxa" w:w="4638"/>
+            <w:tcBorders>
+              <w:top w:val="single" w:color="BFC9C7" w:sz="4"/>
+              <w:left w:val="single" w:color="BFC9C7" w:sz="4"/>
+              <w:bottom w:val="single" w:color="BFC9C7" w:sz="4"/>
+              <w:right w:val="single" w:color="BFC9C7" w:sz="4"/>
+            </w:tcBorders>
+            <w:tcMar>
+              <w:top w:type="dxa" w:w="90"/>
+              <w:left w:type="dxa" w:w="120"/>
+              <w:bottom w:type="dxa" w:w="90"/>
+              <w:right w:type="dxa" w:w="120"/>
+            </w:tcMar>
+          </w:tcPr>
+          <w:p>
+            <w:pPr>
+              <w:spacing w:after="0"/>
+            </w:pPr>
+            <w:r>
+              <w:t xml:space="preserve">FAQ answers</w:t>
+            </w:r>
+          </w:p>
+        </w:tc>
+        <w:tc>
+          <w:tcPr>
+            <w:tcW w:type="dxa" w:w="1900"/>
+            <w:tcBorders>
+              <w:top w:val="single" w:color="BFC9C7" w:sz="4"/>
+              <w:left w:val="single" w:color="BFC9C7" w:sz="4"/>
+              <w:bottom w:val="single" w:color="BFC9C7" w:sz="4"/>
+              <w:right w:val="single" w:color="BFC9C7" w:sz="4"/>
+            </w:tcBorders>
+            <w:tcMar>
+              <w:top w:type="dxa" w:w="90"/>
+              <w:left w:type="dxa" w:w="120"/>
+              <w:bottom w:type="dxa" w:w="90"/>
+              <w:right w:type="dxa" w:w="120"/>
+            </w:tcMar>
+          </w:tcPr>
+          <w:p>
+            <w:pPr>
+              <w:spacing w:after="0"/>
+            </w:pPr>
+            <w:r>
+              <w:t xml:space="preserve"/>
+            </w:r>
+          </w:p>
+        </w:tc>
+        <w:tc>
+          <w:tcPr>
+            <w:tcW w:type="dxa" w:w="2300"/>
+            <w:tcBorders>
+              <w:top w:val="single" w:color="BFC9C7" w:sz="4"/>
+              <w:left w:val="single" w:color="BFC9C7" w:sz="4"/>
+              <w:bottom w:val="single" w:color="BFC9C7" w:sz="4"/>
+              <w:right w:val="single" w:color="BFC9C7" w:sz="4"/>
+            </w:tcBorders>
+            <w:tcMar>
+              <w:top w:type="dxa" w:w="90"/>
+              <w:left w:type="dxa" w:w="120"/>
+              <w:bottom w:type="dxa" w:w="90"/>
+              <w:right w:type="dxa" w:w="120"/>
+            </w:tcMar>
+          </w:tcPr>
+          <w:p>
+            <w:sdt>
+              <w:sdtPr>
+                <w14:checkbox>
+                  <w14:checked w14:val="0"/>
+                  <w14:checkedState w14:val="2612" w14:font="MS Gothic"/>
+                  <w14:uncheckedState w14:val="2610" w14:font="MS Gothic"/>
+                </w14:checkbox>
+              </w:sdtPr>
+              <w:sdtContent>
+                <w:r>
+                  <w:sym w:char="2610" w:font="MS Gothic"/>
+                </w:r>
+              </w:sdtContent>
+            </w:sdt>
+            <w:r>
+              <w:t xml:space="preserve">  Approved</w:t>
+            </w:r>
+          </w:p>
+        </w:tc>
+      </w:tr>
+      <w:tr>
+        <w:tc>
+          <w:tcPr>
             <w:tcW w:type="dxa" w:w="9638"/>
             <w:gridSpan w:val="4"/>
             <w:tcBorders>
@@ -9856,6 +9969,339 @@
             </w:pPr>
             <w:r>
               <w:t xml:space="preserve">Logo files for each partner (names show as text tiles now)</w:t>
+            </w:r>
+          </w:p>
+        </w:tc>
+      </w:tr>
+      <w:tr>
+        <w:trPr>
+          <w:cantSplit/>
+        </w:trPr>
+        <w:tc>
+          <w:tcPr>
+            <w:tcW w:type="dxa" w:w="2300"/>
+            <w:tcBorders>
+              <w:top w:val="single" w:color="BFC9C7" w:sz="4"/>
+              <w:left w:val="single" w:color="BFC9C7" w:sz="4"/>
+              <w:bottom w:val="single" w:color="BFC9C7" w:sz="4"/>
+              <w:right w:val="single" w:color="BFC9C7" w:sz="4"/>
+            </w:tcBorders>
+            <w:shd w:fill="E8F4F2" w:color="auto" w:val="clear"/>
+            <w:tcMar>
+              <w:top w:type="dxa" w:w="90"/>
+              <w:left w:type="dxa" w:w="120"/>
+              <w:bottom w:type="dxa" w:w="90"/>
+              <w:right w:type="dxa" w:w="120"/>
+            </w:tcMar>
+          </w:tcPr>
+          <w:p>
+            <w:pPr>
+              <w:keepNext/>
+              <w:keepLines/>
+              <w:spacing w:after="0"/>
+            </w:pPr>
+            <w:r>
+              <w:rPr>
+                <w:b/>
+                <w:bCs/>
+              </w:rPr>
+              <w:t xml:space="preserve">Owner and date</w:t>
+            </w:r>
+          </w:p>
+        </w:tc>
+        <w:tc>
+          <w:tcPr>
+            <w:tcW w:type="dxa" w:w="7338"/>
+            <w:tcBorders>
+              <w:top w:val="single" w:color="BFC9C7" w:sz="4"/>
+              <w:left w:val="single" w:color="BFC9C7" w:sz="4"/>
+              <w:bottom w:val="single" w:color="BFC9C7" w:sz="4"/>
+              <w:right w:val="single" w:color="BFC9C7" w:sz="4"/>
+            </w:tcBorders>
+            <w:tcMar>
+              <w:top w:type="dxa" w:w="90"/>
+              <w:left w:type="dxa" w:w="120"/>
+              <w:bottom w:type="dxa" w:w="90"/>
+              <w:right w:type="dxa" w:w="120"/>
+            </w:tcMar>
+          </w:tcPr>
+          <w:p>
+            <w:pPr>
+              <w:keepNext/>
+              <w:keepLines/>
+              <w:spacing w:after="0"/>
+            </w:pPr>
+            <w:r>
+              <w:t xml:space="preserve"/>
+            </w:r>
+          </w:p>
+        </w:tc>
+      </w:tr>
+      <w:tr>
+        <w:trPr>
+          <w:trHeight w:val="2600" w:hRule="atLeast"/>
+        </w:trPr>
+        <w:tc>
+          <w:tcPr>
+            <w:tcW w:type="dxa" w:w="2300"/>
+            <w:tcBorders>
+              <w:top w:val="single" w:color="BFC9C7" w:sz="4"/>
+              <w:left w:val="single" w:color="BFC9C7" w:sz="4"/>
+              <w:bottom w:val="single" w:color="BFC9C7" w:sz="4"/>
+              <w:right w:val="single" w:color="BFC9C7" w:sz="4"/>
+            </w:tcBorders>
+            <w:shd w:fill="E8F4F2" w:color="auto" w:val="clear"/>
+            <w:tcMar>
+              <w:top w:type="dxa" w:w="90"/>
+              <w:left w:type="dxa" w:w="120"/>
+              <w:bottom w:type="dxa" w:w="90"/>
+              <w:right w:type="dxa" w:w="120"/>
+            </w:tcMar>
+          </w:tcPr>
+          <w:p>
+            <w:pPr>
+              <w:spacing w:after="60"/>
+            </w:pPr>
+            <w:r>
+              <w:rPr>
+                <w:b/>
+                <w:bCs/>
+              </w:rPr>
+              <w:t xml:space="preserve">Copy</w:t>
+            </w:r>
+          </w:p>
+          <w:p>
+            <w:pPr>
+              <w:spacing w:after="120"/>
+            </w:pPr>
+            <w:r>
+              <w:rPr>
+                <w:i/>
+                <w:iCs/>
+                <w:color w:val="7A7F80"/>
+                <w:sz w:val="18"/>
+                <w:szCs w:val="18"/>
+              </w:rPr>
+              <w:t xml:space="preserve">Write or paste the copy here</w:t>
+            </w:r>
+          </w:p>
+        </w:tc>
+        <w:tc>
+          <w:tcPr>
+            <w:tcW w:type="dxa" w:w="7338"/>
+            <w:tcBorders>
+              <w:top w:val="single" w:color="BFC9C7" w:sz="4"/>
+              <w:left w:val="single" w:color="BFC9C7" w:sz="4"/>
+              <w:bottom w:val="single" w:color="BFC9C7" w:sz="4"/>
+              <w:right w:val="single" w:color="BFC9C7" w:sz="4"/>
+            </w:tcBorders>
+            <w:tcMar>
+              <w:top w:type="dxa" w:w="90"/>
+              <w:left w:type="dxa" w:w="120"/>
+              <w:bottom w:type="dxa" w:w="90"/>
+              <w:right w:type="dxa" w:w="120"/>
+            </w:tcMar>
+          </w:tcPr>
+          <w:p>
+            <w:pPr>
+              <w:spacing w:after="120"/>
+            </w:pPr>
+            <w:r>
+              <w:t xml:space="preserve"/>
+            </w:r>
+          </w:p>
+        </w:tc>
+      </w:tr>
+    </w:tbl>
+    <w:p>
+      <w:pPr>
+        <w:spacing w:after="240"/>
+      </w:pPr>
+      <w:r>
+        <w:t xml:space="preserve"/>
+      </w:r>
+    </w:p>
+    <w:tbl>
+      <w:tblPr>
+        <w:tblW w:type="dxa" w:w="9638"/>
+        <w:tblBorders>
+          <w:top w:val="single" w:color="auto" w:sz="4"/>
+          <w:left w:val="single" w:color="auto" w:sz="4"/>
+          <w:bottom w:val="single" w:color="auto" w:sz="4"/>
+          <w:right w:val="single" w:color="auto" w:sz="4"/>
+          <w:insideH w:val="single" w:color="auto" w:sz="4"/>
+          <w:insideV w:val="single" w:color="auto" w:sz="4"/>
+        </w:tblBorders>
+      </w:tblPr>
+      <w:tblGrid>
+        <w:gridCol w:w="2300"/>
+        <w:gridCol w:w="7338"/>
+      </w:tblGrid>
+      <w:tr>
+        <w:trPr>
+          <w:cantSplit/>
+        </w:trPr>
+        <w:tc>
+          <w:tcPr>
+            <w:tcW w:type="dxa" w:w="9638"/>
+            <w:gridSpan w:val="2"/>
+            <w:tcBorders>
+              <w:top w:val="single" w:color="BFC9C7" w:sz="4"/>
+              <w:left w:val="single" w:color="BFC9C7" w:sz="4"/>
+              <w:bottom w:val="single" w:color="BFC9C7" w:sz="4"/>
+              <w:right w:val="single" w:color="BFC9C7" w:sz="4"/>
+            </w:tcBorders>
+            <w:shd w:fill="2E7D74" w:color="auto" w:val="clear"/>
+            <w:tcMar>
+              <w:top w:type="dxa" w:w="90"/>
+              <w:left w:type="dxa" w:w="120"/>
+              <w:bottom w:type="dxa" w:w="90"/>
+              <w:right w:type="dxa" w:w="120"/>
+            </w:tcMar>
+          </w:tcPr>
+          <w:p>
+            <w:pPr>
+              <w:keepNext/>
+              <w:keepLines/>
+              <w:spacing w:after="0"/>
+            </w:pPr>
+            <w:r>
+              <w:rPr>
+                <w:b/>
+                <w:bCs/>
+                <w:color w:val="FFFFFF"/>
+                <w:sz w:val="24"/>
+                <w:szCs w:val="24"/>
+              </w:rPr>
+              <w:t xml:space="preserve">2.10  FAQ answers</w:t>
+            </w:r>
+          </w:p>
+        </w:tc>
+      </w:tr>
+      <w:tr>
+        <w:trPr>
+          <w:cantSplit/>
+        </w:trPr>
+        <w:tc>
+          <w:tcPr>
+            <w:tcW w:type="dxa" w:w="2300"/>
+            <w:tcBorders>
+              <w:top w:val="single" w:color="BFC9C7" w:sz="4"/>
+              <w:left w:val="single" w:color="BFC9C7" w:sz="4"/>
+              <w:bottom w:val="single" w:color="BFC9C7" w:sz="4"/>
+              <w:right w:val="single" w:color="BFC9C7" w:sz="4"/>
+            </w:tcBorders>
+            <w:shd w:fill="E8F4F2" w:color="auto" w:val="clear"/>
+            <w:tcMar>
+              <w:top w:type="dxa" w:w="90"/>
+              <w:left w:type="dxa" w:w="120"/>
+              <w:bottom w:type="dxa" w:w="90"/>
+              <w:right w:type="dxa" w:w="120"/>
+            </w:tcMar>
+          </w:tcPr>
+          <w:p>
+            <w:pPr>
+              <w:keepNext/>
+              <w:keepLines/>
+              <w:spacing w:after="0"/>
+            </w:pPr>
+            <w:r>
+              <w:rPr>
+                <w:b/>
+                <w:bCs/>
+              </w:rPr>
+              <w:t xml:space="preserve">Where it appears</w:t>
+            </w:r>
+          </w:p>
+        </w:tc>
+        <w:tc>
+          <w:tcPr>
+            <w:tcW w:type="dxa" w:w="7338"/>
+            <w:tcBorders>
+              <w:top w:val="single" w:color="BFC9C7" w:sz="4"/>
+              <w:left w:val="single" w:color="BFC9C7" w:sz="4"/>
+              <w:bottom w:val="single" w:color="BFC9C7" w:sz="4"/>
+              <w:right w:val="single" w:color="BFC9C7" w:sz="4"/>
+            </w:tcBorders>
+            <w:tcMar>
+              <w:top w:type="dxa" w:w="90"/>
+              <w:left w:type="dxa" w:w="120"/>
+              <w:bottom w:type="dxa" w:w="90"/>
+              <w:right w:type="dxa" w:w="120"/>
+            </w:tcMar>
+          </w:tcPr>
+          <w:p>
+            <w:pPr>
+              <w:keepNext/>
+              <w:keepLines/>
+              <w:spacing w:after="0"/>
+            </w:pPr>
+            <w:r>
+              <w:t xml:space="preserve">Resources, FAQs page (31 questions); also used by the website chat</w:t>
+            </w:r>
+          </w:p>
+        </w:tc>
+      </w:tr>
+      <w:tr>
+        <w:trPr>
+          <w:cantSplit/>
+        </w:trPr>
+        <w:tc>
+          <w:tcPr>
+            <w:tcW w:type="dxa" w:w="2300"/>
+            <w:tcBorders>
+              <w:top w:val="single" w:color="BFC9C7" w:sz="4"/>
+              <w:left w:val="single" w:color="BFC9C7" w:sz="4"/>
+              <w:bottom w:val="single" w:color="BFC9C7" w:sz="4"/>
+              <w:right w:val="single" w:color="BFC9C7" w:sz="4"/>
+            </w:tcBorders>
+            <w:shd w:fill="E8F4F2" w:color="auto" w:val="clear"/>
+            <w:tcMar>
+              <w:top w:type="dxa" w:w="90"/>
+              <w:left w:type="dxa" w:w="120"/>
+              <w:bottom w:type="dxa" w:w="90"/>
+              <w:right w:type="dxa" w:w="120"/>
+            </w:tcMar>
+          </w:tcPr>
+          <w:p>
+            <w:pPr>
+              <w:keepNext/>
+              <w:keepLines/>
+              <w:spacing w:after="0"/>
+            </w:pPr>
+            <w:r>
+              <w:rPr>
+                <w:b/>
+                <w:bCs/>
+              </w:rPr>
+              <w:t xml:space="preserve">What we need</w:t>
+            </w:r>
+          </w:p>
+        </w:tc>
+        <w:tc>
+          <w:tcPr>
+            <w:tcW w:type="dxa" w:w="7338"/>
+            <w:tcBorders>
+              <w:top w:val="single" w:color="BFC9C7" w:sz="4"/>
+              <w:left w:val="single" w:color="BFC9C7" w:sz="4"/>
+              <w:bottom w:val="single" w:color="BFC9C7" w:sz="4"/>
+              <w:right w:val="single" w:color="BFC9C7" w:sz="4"/>
+            </w:tcBorders>
+            <w:tcMar>
+              <w:top w:type="dxa" w:w="90"/>
+              <w:left w:type="dxa" w:w="120"/>
+              <w:bottom w:type="dxa" w:w="90"/>
+              <w:right w:type="dxa" w:w="120"/>
+            </w:tcMar>
+          </w:tcPr>
+          <w:p>
+            <w:pPr>
+              <w:keepNext/>
+              <w:keepLines/>
+              <w:spacing w:after="0"/>
+            </w:pPr>
+            <w:r>
+              <w:t xml:space="preserve">Check every answer, especially the underwriter syndicates, ACC top-up, meth cover limits, inspection obligations and the travel emergency number</w:t>
             </w:r>
           </w:p>
         </w:tc>

</xml_diff>

<commit_message>
Hide case studies until Phase 2
A features.caseStudies switch in src/content/site.ts (off) removes the Case
Studies menu item, the home page case study block, the Discover our case
studies buttons on the Solutions and product pages, and the search, sitemap
and chat entries. The page itself returns not found until it's switched on.
The copy tracker marks the case study items as Phase 2.

Co-Authored-By: Claude Opus 5.5 <noreply@anthropic.com>
Claude-Session: https://claude.ai/code/session_01Eh5mpih4ShNW6P8Q6cSYEM
</commit_message>
<xml_diff>
--- a/docs/Otta copy tracker.docx
+++ b/docs/Otta copy tracker.docx
@@ -7304,7 +7304,7 @@
               <w:spacing w:after="0"/>
             </w:pPr>
             <w:r>
-              <w:t xml:space="preserve">A client heading, a one-sentence summary of their challenge, and a short paragraph on how Otta helped</w:t>
+              <w:t xml:space="preserve">Phase 2 (case studies are hidden from the website until then). A client heading, a one-sentence summary of their challenge, and a short paragraph on how Otta helped</w:t>
             </w:r>
           </w:p>
         </w:tc>
@@ -7637,7 +7637,7 @@
               <w:spacing w:after="0"/>
             </w:pPr>
             <w:r>
-              <w:t xml:space="preserve">For each: client name or heading, a two-sentence summary, and (optional) the full story</w:t>
+              <w:t xml:space="preserve">Phase 2 (case studies are hidden from the website until then). For each: client name or heading, a two-sentence summary, and (optional) the full story</w:t>
             </w:r>
           </w:p>
         </w:tc>
@@ -11329,7 +11329,7 @@
               <w:spacing w:after="0"/>
             </w:pPr>
             <w:r>
-              <w:t xml:space="preserve">A photo for each case study (the Sky Tower, floor plan and meeting photos stand in for now)</w:t>
+              <w:t xml:space="preserve">Phase 2 (case studies are hidden from the website until then). A photo for each case study (the Sky Tower, floor plan and meeting photos stand in for now)</w:t>
             </w:r>
           </w:p>
         </w:tc>

</xml_diff>